<commit_message>
added circular explosions by modifying the RandomCircle Point generation
</commit_message>
<xml_diff>
--- a/Particle Explosion Worksheet.docx
+++ b/Particle Explosion Worksheet.docx
@@ -127,15 +127,29 @@
       </w:r>
     </w:p>
     <w:p>
-      <w:r>
+      <w:pPr>
+        <w:rPr>
+          <w:highlight w:val="yellow"/>
+        </w:rPr>
+      </w:pPr>
+      <w:r>
+        <w:rPr>
+          <w:highlight w:val="yellow"/>
+        </w:rPr>
         <w:t xml:space="preserve">Go to the project menu and Add Class. Call this new class </w:t>
       </w:r>
       <w:proofErr w:type="spellStart"/>
       <w:r>
+        <w:rPr>
+          <w:highlight w:val="yellow"/>
+        </w:rPr>
         <w:t>Particle.cs</w:t>
       </w:r>
       <w:proofErr w:type="spellEnd"/>
       <w:r>
+        <w:rPr>
+          <w:highlight w:val="yellow"/>
+        </w:rPr>
         <w:t xml:space="preserve"> (note the capital P)</w:t>
       </w:r>
     </w:p>

</xml_diff>